<commit_message>
Session 1 rework: 27 activities, no per-activity timings, branded PPTX
- DISCOVER: 5 activities (was 2)
- ACTIVITY: 8 activities (was 4)
- KEY IDEAS: 4 activities (was 1)
- DISCUSSION: 6 activities (was 3)
- CLOSING: 4 activities (was 2)
- Block timings kept; per-activity timings removed
- PPTX now branded with Robocode logo, gradient bars, mascot
- DOCX branded with logo header

Co-Authored-By: Claude Opus 4.6 <noreply@anthropic.com>
</commit_message>
<xml_diff>
--- a/assets/downloads/Session 1 - What Is Digital Youth Work? (Facilitator Guide).docx
+++ b/assets/downloads/Session 1 - What Is Digital Youth Work? (Facilitator Guide).docx
@@ -3,17 +3,39 @@
 <w:document xmlns:wpc="http://schemas.microsoft.com/office/word/2010/wordprocessingCanvas" xmlns:mo="http://schemas.microsoft.com/office/mac/office/2008/main" xmlns:mc="http://schemas.openxmlformats.org/markup-compatibility/2006" xmlns:mv="urn:schemas-microsoft-com:mac:vml" xmlns:o="urn:schemas-microsoft-com:office:office" xmlns:r="http://schemas.openxmlformats.org/officeDocument/2006/relationships" xmlns:m="http://schemas.openxmlformats.org/officeDocument/2006/math" xmlns:v="urn:schemas-microsoft-com:vml" xmlns:wp14="http://schemas.microsoft.com/office/word/2010/wordprocessingDrawing" xmlns:wp="http://schemas.openxmlformats.org/drawingml/2006/wordprocessingDrawing" xmlns:w10="urn:schemas-microsoft-com:office:word" xmlns:w="http://schemas.openxmlformats.org/wordprocessingml/2006/main" xmlns:w14="http://schemas.microsoft.com/office/word/2010/wordml" xmlns:wpg="http://schemas.microsoft.com/office/word/2010/wordprocessingGroup" xmlns:wpi="http://schemas.microsoft.com/office/word/2010/wordprocessingInk" xmlns:wne="http://schemas.microsoft.com/office/word/2006/wordml" xmlns:wps="http://schemas.microsoft.com/office/word/2010/wordprocessingShape" mc:Ignorable="w14 wp14">
   <w:body>
     <w:p>
-      <w:pPr>
-        <w:jc w:val="right"/>
-      </w:pPr>
       <w:r>
-        <w:rPr>
-          <w:rFonts w:ascii="Calibri" w:hAnsi="Calibri"/>
-          <w:b w:val="0"/>
-          <w:color w:val="888888"/>
-          <w:sz w:val="20"/>
-        </w:rPr>
-        <w:t>Robocode x LIA  |  Digital Youth Work CPD Programme</w:t>
+        <w:drawing>
+          <wp:inline xmlns:a="http://schemas.openxmlformats.org/drawingml/2006/main" xmlns:pic="http://schemas.openxmlformats.org/drawingml/2006/picture">
+            <wp:extent cx="1645920" cy="382445"/>
+            <wp:docPr id="1" name="Picture 1"/>
+            <wp:cNvGraphicFramePr>
+              <a:graphicFrameLocks noChangeAspect="1"/>
+            </wp:cNvGraphicFramePr>
+            <a:graphic>
+              <a:graphicData uri="http://schemas.openxmlformats.org/drawingml/2006/picture">
+                <pic:pic>
+                  <pic:nvPicPr>
+                    <pic:cNvPr id="0" name="logo.png"/>
+                    <pic:cNvPicPr/>
+                  </pic:nvPicPr>
+                  <pic:blipFill>
+                    <a:blip r:embed="rId9"/>
+                    <a:stretch>
+                      <a:fillRect/>
+                    </a:stretch>
+                  </pic:blipFill>
+                  <pic:spPr>
+                    <a:xfrm>
+                      <a:off x="0" y="0"/>
+                      <a:ext cx="1645920" cy="382445"/>
+                    </a:xfrm>
+                    <a:prstGeom prst="rect"/>
+                  </pic:spPr>
+                </pic:pic>
+              </a:graphicData>
+            </a:graphic>
+          </wp:inline>
+        </w:drawing>
       </w:r>
     </w:p>
     <w:p>
@@ -21,18 +43,20 @@
         <w:pStyle w:val="Title"/>
       </w:pPr>
       <w:r>
+        <w:rPr>
+          <w:color w:val="0D0D1A"/>
+        </w:rPr>
         <w:t>Session 1: What Is Digital Youth Work?</w:t>
       </w:r>
     </w:p>
     <w:p>
       <w:r>
         <w:rPr>
-          <w:rFonts w:ascii="Calibri" w:hAnsi="Calibri"/>
           <w:b/>
-          <w:color w:val="4EA8E6"/>
-          <w:sz w:val="28"/>
+          <w:color w:val="7B61FF"/>
+          <w:sz w:val="22"/>
         </w:rPr>
-        <w:t>Facilitator Guide</w:t>
+        <w:t>Facilitator Guide  ·  Digital Youth Work CPD  ·  Robocode × LIA</w:t>
       </w:r>
     </w:p>
     <w:p/>
@@ -42,7 +66,7 @@
       </w:pPr>
       <w:r>
         <w:rPr>
-          <w:color w:val="1A1A1A"/>
+          <w:color w:val="E91E8C"/>
         </w:rPr>
         <w:t>Learning Objectives (LIA Template)</w:t>
       </w:r>
@@ -50,8 +74,8 @@
     <w:p>
       <w:r>
         <w:rPr>
-          <w:rFonts w:ascii="Calibri" w:hAnsi="Calibri"/>
           <w:b/>
+          <w:color w:val="00A6AD"/>
           <w:sz w:val="24"/>
         </w:rPr>
         <w:t>Aim</w:t>
@@ -59,20 +83,14 @@
     </w:p>
     <w:p>
       <w:r>
-        <w:rPr>
-          <w:rFonts w:ascii="Calibri" w:hAnsi="Calibri"/>
-          <w:b w:val="0"/>
-          <w:sz w:val="22"/>
-        </w:rPr>
         <w:t>Practitioners experience digital youth work from a young person's perspective and identify how environment design is practice.</w:t>
       </w:r>
     </w:p>
-    <w:p/>
     <w:p>
       <w:r>
         <w:rPr>
-          <w:rFonts w:ascii="Calibri" w:hAnsi="Calibri"/>
           <w:b/>
+          <w:color w:val="00A6AD"/>
           <w:sz w:val="24"/>
         </w:rPr>
         <w:t>Objectives</w:t>
@@ -110,12 +128,11 @@
         <w:t>Name one design choice that expresses a youth work value</w:t>
       </w:r>
     </w:p>
-    <w:p/>
     <w:p>
       <w:r>
         <w:rPr>
-          <w:rFonts w:ascii="Calibri" w:hAnsi="Calibri"/>
           <w:b/>
+          <w:color w:val="00A6AD"/>
           <w:sz w:val="24"/>
         </w:rPr>
         <w:t>Outcomes</w:t>
@@ -164,7 +181,7 @@
       </w:pPr>
       <w:r>
         <w:rPr>
-          <w:color w:val="1A1A1A"/>
+          <w:color w:val="E91E8C"/>
         </w:rPr>
         <w:t>Session Plan</w:t>
       </w:r>
@@ -239,7 +256,7 @@
           </w:tcPr>
           <w:p>
             <w:r>
-              <w:t>Spectrum Line, Quick-Fire Word Cloud</w:t>
+              <w:t>5 activities — pick what fits your group</w:t>
             </w:r>
           </w:p>
         </w:tc>
@@ -271,7 +288,7 @@
           </w:tcPr>
           <w:p>
             <w:r>
-              <w:t>Play the Quiz (As a Young Person), What Just Happened?, Change One Thing, Design Decision Cards</w:t>
+              <w:t>8 activities — pick what fits your group</w:t>
             </w:r>
           </w:p>
         </w:tc>
@@ -303,7 +320,7 @@
           </w:tcPr>
           <w:p>
             <w:r>
-              <w:t>Sort the Examples</w:t>
+              <w:t>4 activities — pick what fits your group</w:t>
             </w:r>
           </w:p>
         </w:tc>
@@ -335,7 +352,7 @@
           </w:tcPr>
           <w:p>
             <w:r>
-              <w:t>Tool Speed-Date, Design Your Own, Gallery Walk</w:t>
+              <w:t>6 activities — pick what fits your group</w:t>
             </w:r>
           </w:p>
         </w:tc>
@@ -367,7 +384,7 @@
           </w:tcPr>
           <w:p>
             <w:r>
-              <w:t>One Thing I'll Try, Exit Ticket</w:t>
+              <w:t>4 activities — pick what fits your group</w:t>
             </w:r>
           </w:p>
         </w:tc>
@@ -375,108 +392,12 @@
     </w:tbl>
     <w:p/>
     <w:p>
-      <w:pPr>
-        <w:pStyle w:val="Heading2"/>
-      </w:pPr>
       <w:r>
         <w:rPr>
-          <w:color w:val="1A1A1A"/>
+          <w:i/>
+          <w:color w:val="7B7B96"/>
         </w:rPr>
-        <w:t>1. DISCOVER (0 – 15 min)</w:t>
-      </w:r>
-    </w:p>
-    <w:p>
-      <w:r>
-        <w:rPr>
-          <w:rFonts w:ascii="Calibri" w:hAnsi="Calibri"/>
-          <w:b/>
-          <w:sz w:val="22"/>
-        </w:rPr>
-        <w:t>Opening Question:</w:t>
-      </w:r>
-    </w:p>
-    <w:p>
-      <w:r>
-        <w:rPr>
-          <w:rFonts w:ascii="Calibri" w:hAnsi="Calibri"/>
-          <w:b/>
-          <w:color w:val="4EA8E6"/>
-          <w:sz w:val="26"/>
-        </w:rPr>
-        <w:t>"How does youth work change when young people are online?"</w:t>
-      </w:r>
-    </w:p>
-    <w:p>
-      <w:r>
-        <w:rPr>
-          <w:rFonts w:ascii="Calibri" w:hAnsi="Calibri"/>
-          <w:b/>
-          <w:sz w:val="22"/>
-        </w:rPr>
-        <w:t>What this means:</w:t>
-      </w:r>
-    </w:p>
-    <w:p>
-      <w:r>
-        <w:rPr>
-          <w:rFonts w:ascii="Calibri" w:hAnsi="Calibri"/>
-          <w:b w:val="0"/>
-          <w:sz w:val="22"/>
-        </w:rPr>
-        <w:t>This isn't about technology. It's about whether the things you already do as a youth worker — building trust, giving young people a voice, keeping them safe — work the same way on a screen.</w:t>
-      </w:r>
-    </w:p>
-    <w:p/>
-    <w:p>
-      <w:r>
-        <w:rPr>
-          <w:rFonts w:ascii="Calibri" w:hAnsi="Calibri"/>
-          <w:b/>
-          <w:sz w:val="24"/>
-        </w:rPr>
-        <w:t>▶  Spectrum Line  (5 min)</w:t>
-      </w:r>
-    </w:p>
-    <w:p>
-      <w:r>
-        <w:rPr>
-          <w:rFonts w:ascii="Calibri" w:hAnsi="Calibri"/>
-          <w:b w:val="0"/>
-          <w:sz w:val="22"/>
-        </w:rPr>
-        <w:t>Stand along an imaginary line: one end = 'I use digital tools every day with young people', other end = 'I barely use anything digital'. Look at where everyone is. Brief chat about why.</w:t>
-      </w:r>
-    </w:p>
-    <w:p/>
-    <w:p>
-      <w:r>
-        <w:rPr>
-          <w:rFonts w:ascii="Calibri" w:hAnsi="Calibri"/>
-          <w:b/>
-          <w:sz w:val="24"/>
-        </w:rPr>
-        <w:t>▶  Quick-Fire Word Cloud  (5 min)</w:t>
-      </w:r>
-    </w:p>
-    <w:p>
-      <w:r>
-        <w:rPr>
-          <w:rFonts w:ascii="Calibri" w:hAnsi="Calibri"/>
-          <w:b w:val="0"/>
-          <w:color w:val="4EA8E6"/>
-          <w:sz w:val="20"/>
-        </w:rPr>
-        <w:t>Tool: Mentimeter</w:t>
-      </w:r>
-    </w:p>
-    <w:p>
-      <w:r>
-        <w:rPr>
-          <w:rFonts w:ascii="Calibri" w:hAnsi="Calibri"/>
-          <w:b w:val="0"/>
-          <w:sz w:val="22"/>
-        </w:rPr>
-        <w:t>Everyone submits 3 words that come to mind when they hear 'digital youth work'. Show the word cloud live on screen. What stands out? What's missing?</w:t>
+        <w:t>Note: Each block has more activities than you can fit. Pick what matches your group. Running short on time is better than rushing.</w:t>
       </w:r>
     </w:p>
     <w:p/>
@@ -486,7 +407,172 @@
       </w:pPr>
       <w:r>
         <w:rPr>
-          <w:color w:val="1A1A1A"/>
+          <w:color w:val="00A6AD"/>
+        </w:rPr>
+        <w:t>1. DISCOVER (0 – 15 min)</w:t>
+      </w:r>
+    </w:p>
+    <w:p>
+      <w:r>
+        <w:rPr>
+          <w:b/>
+        </w:rPr>
+        <w:t>Opening Question:</w:t>
+      </w:r>
+    </w:p>
+    <w:p>
+      <w:r>
+        <w:rPr>
+          <w:i/>
+          <w:color w:val="00A6AD"/>
+          <w:sz w:val="26"/>
+        </w:rPr>
+        <w:t>"How does youth work change when young people are online?"</w:t>
+      </w:r>
+    </w:p>
+    <w:p>
+      <w:r>
+        <w:rPr>
+          <w:b/>
+        </w:rPr>
+        <w:t xml:space="preserve">What this means: </w:t>
+      </w:r>
+      <w:r>
+        <w:t>This isn't about technology. It's about whether the things you already do as a youth worker — building trust, giving young people a voice, keeping them safe — work the same way on a screen.</w:t>
+      </w:r>
+    </w:p>
+    <w:p/>
+    <w:p>
+      <w:r>
+        <w:rPr>
+          <w:b/>
+          <w:sz w:val="24"/>
+        </w:rPr>
+        <w:t>▶  Spectrum Line</w:t>
+      </w:r>
+    </w:p>
+    <w:p>
+      <w:r>
+        <w:t>Stand along an imaginary line: one end = 'I use digital tools every day with young people', other end = 'I barely use anything digital'. Look at where everyone is. Brief chat about why.</w:t>
+      </w:r>
+    </w:p>
+    <w:p/>
+    <w:p>
+      <w:r>
+        <w:rPr>
+          <w:b/>
+          <w:sz w:val="24"/>
+        </w:rPr>
+        <w:t>▶  Quick-Fire Word Cloud</w:t>
+      </w:r>
+    </w:p>
+    <w:p>
+      <w:r>
+        <w:rPr>
+          <w:color w:val="E91E8C"/>
+          <w:sz w:val="20"/>
+        </w:rPr>
+        <w:t>Tool: Mentimeter</w:t>
+      </w:r>
+    </w:p>
+    <w:p>
+      <w:r>
+        <w:t>Everyone submits 3 words that come to mind when they hear 'digital youth work'. Show the word cloud live on screen. What stands out? What's missing?</w:t>
+      </w:r>
+    </w:p>
+    <w:p/>
+    <w:p>
+      <w:r>
+        <w:rPr>
+          <w:b/>
+          <w:sz w:val="24"/>
+        </w:rPr>
+        <w:t>▶  Pocket Audit</w:t>
+      </w:r>
+    </w:p>
+    <w:p>
+      <w:r>
+        <w:t>Everyone opens their phone, names one app they use daily, and says why. What does this tell us about what makes platforms sticky — for us and for young people?</w:t>
+      </w:r>
+    </w:p>
+    <w:p/>
+    <w:p>
+      <w:r>
+        <w:rPr>
+          <w:b/>
+          <w:sz w:val="24"/>
+        </w:rPr>
+        <w:t>▶  Yes / No / Maybe Corners</w:t>
+      </w:r>
+    </w:p>
+    <w:p>
+      <w:r>
+        <w:t>Facilitator reads 4 statements. Participants move to the Yes, No, or Maybe corner of the room. Keep it quick — don't debate, just move.</w:t>
+      </w:r>
+    </w:p>
+    <w:p>
+      <w:r>
+        <w:rPr>
+          <w:b/>
+        </w:rPr>
+        <w:t>Examples:</w:t>
+      </w:r>
+    </w:p>
+    <w:p>
+      <w:pPr>
+        <w:pStyle w:val="ListBullet"/>
+      </w:pPr>
+      <w:r>
+        <w:t>I'd be comfortable running a Zoom session with young people tomorrow</w:t>
+      </w:r>
+    </w:p>
+    <w:p>
+      <w:pPr>
+        <w:pStyle w:val="ListBullet"/>
+      </w:pPr>
+      <w:r>
+        <w:t>My organisation has a digital strategy I actually understand</w:t>
+      </w:r>
+    </w:p>
+    <w:p>
+      <w:pPr>
+        <w:pStyle w:val="ListBullet"/>
+      </w:pPr>
+      <w:r>
+        <w:t>I know which platform my young people use most</w:t>
+      </w:r>
+    </w:p>
+    <w:p>
+      <w:pPr>
+        <w:pStyle w:val="ListBullet"/>
+      </w:pPr>
+      <w:r>
+        <w:t>Digital youth work is something we do properly, not just a backup</w:t>
+      </w:r>
+    </w:p>
+    <w:p/>
+    <w:p>
+      <w:r>
+        <w:rPr>
+          <w:b/>
+          <w:sz w:val="24"/>
+        </w:rPr>
+        <w:t>▶  The Time Machine</w:t>
+      </w:r>
+    </w:p>
+    <w:p>
+      <w:r>
+        <w:t>Close your eyes. Picture a 14-year-old from 10 years ago — what was their digital life? Now picture a 14-year-old today. What's changed? Share one thing with a neighbour.</w:t>
+      </w:r>
+    </w:p>
+    <w:p/>
+    <w:p>
+      <w:pPr>
+        <w:pStyle w:val="Heading2"/>
+      </w:pPr>
+      <w:r>
+        <w:rPr>
+          <w:color w:val="E91E8C"/>
         </w:rPr>
         <w:t>2. ACTIVITY (15 – 75 min)</w:t>
       </w:r>
@@ -494,19 +580,16 @@
     <w:p>
       <w:r>
         <w:rPr>
-          <w:rFonts w:ascii="Calibri" w:hAnsi="Calibri"/>
           <w:b/>
           <w:sz w:val="24"/>
         </w:rPr>
-        <w:t>▶  Play the Quiz (As a Young Person)  (15 min)</w:t>
+        <w:t>▶  Play the Quiz (as a young person)</w:t>
       </w:r>
     </w:p>
     <w:p>
       <w:r>
         <w:rPr>
-          <w:rFonts w:ascii="Calibri" w:hAnsi="Calibri"/>
-          <w:b w:val="0"/>
-          <w:color w:val="4EA8E6"/>
+          <w:color w:val="E91E8C"/>
           <w:sz w:val="20"/>
         </w:rPr>
         <w:t>Tool: Kahoot</w:t>
@@ -514,11 +597,6 @@
     </w:p>
     <w:p>
       <w:r>
-        <w:rPr>
-          <w:rFonts w:ascii="Calibri" w:hAnsi="Calibri"/>
-          <w:b w:val="0"/>
-          <w:sz w:val="22"/>
-        </w:rPr>
         <w:t>Join a pre-made Kahoot quiz on your phones. No briefing — just play. Experience the timer, the leaderboard, the music, the pressure. Don't overthink it.</w:t>
       </w:r>
     </w:p>
@@ -527,7 +605,7 @@
         <w:pStyle w:val="ListBullet"/>
       </w:pPr>
       <w:r>
-        <w:t>Facilitator runs a 10-question Kahoot quiz (topic: general knowledge or fun)</w:t>
+        <w:t>Facilitator runs a 10-question Kahoot (topic: general knowledge or fun)</w:t>
       </w:r>
     </w:p>
     <w:p>
@@ -550,20 +628,29 @@
     <w:p>
       <w:r>
         <w:rPr>
-          <w:rFonts w:ascii="Calibri" w:hAnsi="Calibri"/>
           <w:b/>
           <w:sz w:val="24"/>
         </w:rPr>
-        <w:t>▶  What Just Happened?  (10 min)</w:t>
+        <w:t>▶  Observer Round</w:t>
       </w:r>
     </w:p>
     <w:p>
       <w:r>
+        <w:t>Half the group plays a shorter quiz (5 questions) while the other half silently watches. Observers use a worksheet: Who looks stressed? Who lights up? Who disengages? Who's first to answer? Who checks their phone between questions?</w:t>
+      </w:r>
+    </w:p>
+    <w:p/>
+    <w:p>
+      <w:r>
         <w:rPr>
-          <w:rFonts w:ascii="Calibri" w:hAnsi="Calibri"/>
-          <w:b w:val="0"/>
-          <w:sz w:val="22"/>
+          <w:b/>
+          <w:sz w:val="24"/>
         </w:rPr>
+        <w:t>▶  What Just Happened?</w:t>
+      </w:r>
+    </w:p>
+    <w:p>
+      <w:r>
         <w:t>Debrief the experience before changing anything.</w:t>
       </w:r>
     </w:p>
@@ -572,7 +659,7 @@
         <w:pStyle w:val="ListBullet"/>
       </w:pPr>
       <w:r>
-        <w:t>Quick show of hands: Who felt competitive? Who felt stressed? Who stopped caring?</w:t>
+        <w:t>Show of hands: Who felt competitive? Who felt stressed? Who stopped caring?</w:t>
       </w:r>
     </w:p>
     <w:p>
@@ -580,7 +667,7 @@
         <w:pStyle w:val="ListBullet"/>
       </w:pPr>
       <w:r>
-        <w:t>On sticky notes, write: one thing that felt good, one thing that felt bad</w:t>
+        <w:t>On sticky notes: one thing that felt good, one thing that felt bad</w:t>
       </w:r>
     </w:p>
     <w:p>
@@ -591,23 +678,28 @@
         <w:t>Stick them on the board in two columns. Read a few out.</w:t>
       </w:r>
     </w:p>
+    <w:p>
+      <w:pPr>
+        <w:pStyle w:val="ListBullet"/>
+      </w:pPr>
+      <w:r>
+        <w:t>Observers share what they saw — not what players said, what they saw</w:t>
+      </w:r>
+    </w:p>
     <w:p/>
     <w:p>
       <w:r>
         <w:rPr>
-          <w:rFonts w:ascii="Calibri" w:hAnsi="Calibri"/>
           <w:b/>
           <w:sz w:val="24"/>
         </w:rPr>
-        <w:t>▶  Change One Thing  (25 min)</w:t>
+        <w:t>▶  Change One Thing</w:t>
       </w:r>
     </w:p>
     <w:p>
       <w:r>
         <w:rPr>
-          <w:rFonts w:ascii="Calibri" w:hAnsi="Calibri"/>
-          <w:b w:val="0"/>
-          <w:color w:val="4EA8E6"/>
+          <w:color w:val="E91E8C"/>
           <w:sz w:val="20"/>
         </w:rPr>
         <w:t>Tool: Kahoot</w:t>
@@ -615,11 +707,6 @@
     </w:p>
     <w:p>
       <w:r>
-        <w:rPr>
-          <w:rFonts w:ascii="Calibri" w:hAnsi="Calibri"/>
-          <w:b w:val="0"/>
-          <w:sz w:val="22"/>
-        </w:rPr>
         <w:t>In pairs, pick ONE setting to change and re-run part of the quiz.</w:t>
       </w:r>
     </w:p>
@@ -628,7 +715,7 @@
         <w:pStyle w:val="ListBullet"/>
       </w:pPr>
       <w:r>
-        <w:t>Options: remove the timer / hide the leaderboard / make answers anonymous / let people work in teams / remove the music</w:t>
+        <w:t>Options: remove the timer / hide the leaderboard / enable anonymous answers / team mode / remove the music</w:t>
       </w:r>
     </w:p>
     <w:p>
@@ -636,7 +723,7 @@
         <w:pStyle w:val="ListBullet"/>
       </w:pPr>
       <w:r>
-        <w:t>Each pair picks one change. Facilitator sets up a shorter quiz (5 questions) with that change</w:t>
+        <w:t>Facilitator sets up a shorter quiz with the change</w:t>
       </w:r>
     </w:p>
     <w:p>
@@ -651,21 +738,78 @@
     <w:p>
       <w:r>
         <w:rPr>
-          <w:rFonts w:ascii="Calibri" w:hAnsi="Calibri"/>
           <w:b/>
           <w:sz w:val="24"/>
         </w:rPr>
-        <w:t>▶  Design Decision Cards  (10 min)</w:t>
+        <w:t>▶  The Anonymous Round</w:t>
       </w:r>
     </w:p>
     <w:p>
       <w:r>
         <w:rPr>
-          <w:rFonts w:ascii="Calibri" w:hAnsi="Calibri"/>
-          <w:b w:val="0"/>
-          <w:sz w:val="22"/>
+          <w:color w:val="E91E8C"/>
+          <w:sz w:val="20"/>
         </w:rPr>
-        <w:t>Each pair gets a card to fill in: 'We changed ___ because ___. The effect was ___.' Share back to the group.</w:t>
+        <w:t>Tool: Kahoot</w:t>
+      </w:r>
+    </w:p>
+    <w:p>
+      <w:r>
+        <w:t>Re-run with anonymous nicknames (no real names on the leaderboard). Does anything shift? Who contributes now who didn't before? Who goes quieter? Note it down.</w:t>
+      </w:r>
+    </w:p>
+    <w:p/>
+    <w:p>
+      <w:r>
+        <w:rPr>
+          <w:b/>
+          <w:sz w:val="24"/>
+        </w:rPr>
+        <w:t>▶  Settings Gallery</w:t>
+      </w:r>
+    </w:p>
+    <w:p>
+      <w:r>
+        <w:t>Pin a card on the wall for each Kahoot setting (timer, leaderboard, music, team mode, anonymous, chat, skip-allowed). In pairs, walk round and add a sticky note to each: 'What this changes for the young person.' Read the wall as a group.</w:t>
+      </w:r>
+    </w:p>
+    <w:p/>
+    <w:p>
+      <w:r>
+        <w:rPr>
+          <w:b/>
+          <w:sz w:val="24"/>
+        </w:rPr>
+        <w:t>▶  Design Decision Cards</w:t>
+      </w:r>
+    </w:p>
+    <w:p>
+      <w:r>
+        <w:t>Each pair fills in a card: 'We changed ___ because ___. The effect was ___. For a young person who ___ this would mean ___.' Share back to the group.</w:t>
+      </w:r>
+    </w:p>
+    <w:p/>
+    <w:p>
+      <w:r>
+        <w:rPr>
+          <w:b/>
+          <w:sz w:val="24"/>
+        </w:rPr>
+        <w:t>▶  Second Pass — Swap</w:t>
+      </w:r>
+    </w:p>
+    <w:p>
+      <w:r>
+        <w:rPr>
+          <w:color w:val="E91E8C"/>
+          <w:sz w:val="20"/>
+        </w:rPr>
+        <w:t>Tool: Kahoot</w:t>
+      </w:r>
+    </w:p>
+    <w:p>
+      <w:r>
+        <w:t>Observers now play; players now observe. Different setting changed. Observers: what do you notice now that you missed when you were playing? Players: what's different knowing someone is watching?</w:t>
       </w:r>
     </w:p>
     <w:p/>
@@ -675,7 +819,7 @@
       </w:pPr>
       <w:r>
         <w:rPr>
-          <w:color w:val="1A1A1A"/>
+          <w:color w:val="7B61FF"/>
         </w:rPr>
         <w:t>3. KEY IDEAS (75 – 95 min)</w:t>
       </w:r>
@@ -683,7 +827,6 @@
     <w:p>
       <w:r>
         <w:rPr>
-          <w:rFonts w:ascii="Calibri" w:hAnsi="Calibri"/>
           <w:b/>
           <w:sz w:val="24"/>
         </w:rPr>
@@ -692,12 +835,7 @@
     </w:p>
     <w:p>
       <w:r>
-        <w:rPr>
-          <w:rFonts w:ascii="Calibri" w:hAnsi="Calibri"/>
-          <w:b w:val="0"/>
-          <w:sz w:val="22"/>
-        </w:rPr>
-        <w:t>Keep this to 15-20 minutes. Use the slides. Key points:</w:t>
+        <w:t>Keep this to 15–20 minutes. Use the slides. Key points:</w:t>
       </w:r>
     </w:p>
     <w:p>
@@ -728,29 +866,21 @@
     <w:p>
       <w:r>
         <w:rPr>
-          <w:rFonts w:ascii="Calibri" w:hAnsi="Calibri"/>
           <w:b/>
           <w:sz w:val="24"/>
         </w:rPr>
-        <w:t>▶  Sort the Examples  (10 min)</w:t>
+        <w:t>▶  Sort the Examples</w:t>
       </w:r>
     </w:p>
     <w:p>
       <w:r>
-        <w:rPr>
-          <w:rFonts w:ascii="Calibri" w:hAnsi="Calibri"/>
-          <w:b w:val="0"/>
-          <w:sz w:val="22"/>
-        </w:rPr>
         <w:t>Facilitator reads out 8 examples. Participants hold up a card: 'DIGITISED' or 'DIGITAL'. Discuss any disagreements.</w:t>
       </w:r>
     </w:p>
     <w:p>
       <w:r>
         <w:rPr>
-          <w:rFonts w:ascii="Calibri" w:hAnsi="Calibri"/>
           <w:b/>
-          <w:sz w:val="22"/>
         </w:rPr>
         <w:t>Examples:</w:t>
       </w:r>
@@ -821,98 +951,47 @@
     </w:p>
     <w:p/>
     <w:p>
-      <w:pPr>
-        <w:pStyle w:val="Heading2"/>
-      </w:pPr>
       <w:r>
         <w:rPr>
-          <w:color w:val="1A1A1A"/>
+          <w:b/>
+          <w:sz w:val="24"/>
         </w:rPr>
-        <w:t>4. DISCUSSION (95 – 150 min)</w:t>
+        <w:t>▶  Sort Your Own Practice</w:t>
       </w:r>
     </w:p>
     <w:p>
       <w:r>
-        <w:rPr>
-          <w:rFonts w:ascii="Calibri" w:hAnsi="Calibri"/>
-          <w:b/>
-          <w:sz w:val="24"/>
-        </w:rPr>
-        <w:t>▶  Tool Speed-Date  (20 min)</w:t>
-      </w:r>
-    </w:p>
-    <w:p>
-      <w:r>
-        <w:rPr>
-          <w:rFonts w:ascii="Calibri" w:hAnsi="Calibri"/>
-          <w:b w:val="0"/>
-          <w:color w:val="4EA8E6"/>
-          <w:sz w:val="20"/>
-        </w:rPr>
-        <w:t>Tool: Mentimeter + Padlet</w:t>
-      </w:r>
-    </w:p>
-    <w:p>
-      <w:r>
-        <w:rPr>
-          <w:rFonts w:ascii="Calibri" w:hAnsi="Calibri"/>
-          <w:b w:val="0"/>
-          <w:sz w:val="22"/>
-        </w:rPr>
-        <w:t>3-minute rotations. Each table has a different tool open (Kahoot, Mentimeter, Padlet). Try it for 3 minutes, then rotate. At the end, vote: which felt most useful for YOUR group?</w:t>
+        <w:t>Two boards on the wall: DIGITISED and DIGITAL. Everyone takes one activity they currently run and sticks it on whichever board it fits. Be honest — if it's digitised paper, that's fine, just name it. Walk the wall.</w:t>
       </w:r>
     </w:p>
     <w:p/>
     <w:p>
       <w:r>
         <w:rPr>
-          <w:rFonts w:ascii="Calibri" w:hAnsi="Calibri"/>
           <w:b/>
           <w:sz w:val="24"/>
         </w:rPr>
-        <w:t>▶  Design Your Own  (20 min)</w:t>
+        <w:t>▶  Values Hidden in Settings</w:t>
       </w:r>
     </w:p>
     <w:p>
       <w:r>
-        <w:rPr>
-          <w:rFonts w:ascii="Calibri" w:hAnsi="Calibri"/>
-          <w:b w:val="0"/>
-          <w:color w:val="4EA8E6"/>
-          <w:sz w:val="20"/>
-        </w:rPr>
-        <w:t>Tool: Paper or Padlet</w:t>
-      </w:r>
-    </w:p>
-    <w:p>
-      <w:r>
-        <w:rPr>
-          <w:rFonts w:ascii="Calibri" w:hAnsi="Calibri"/>
-          <w:b w:val="0"/>
-          <w:sz w:val="22"/>
-        </w:rPr>
-        <w:t>In pairs, sketch a 10-minute digital activity you could run with your group next week. Use any tool. Keep it simple. Write down: What tool? What do participants do? What's the one setting you'd change to make it work for YOUR group?</w:t>
+        <w:t>Facilitator shows a setting (leaderboard, timer, chat disabled, anonymous mode). In pairs, write down what value that setting expresses. Compare answers across the room. Same setting, different values? That's the conversation.</w:t>
       </w:r>
     </w:p>
     <w:p/>
     <w:p>
       <w:r>
         <w:rPr>
-          <w:rFonts w:ascii="Calibri" w:hAnsi="Calibri"/>
           <w:b/>
           <w:sz w:val="24"/>
         </w:rPr>
-        <w:t>▶  Gallery Walk  (15 min)</w:t>
+        <w:t>▶  One Slide, One Question</w:t>
       </w:r>
     </w:p>
     <w:p>
       <w:r>
-        <w:rPr>
-          <w:rFonts w:ascii="Calibri" w:hAnsi="Calibri"/>
-          <w:b w:val="0"/>
-          <w:sz w:val="22"/>
-        </w:rPr>
-        <w:t>Pairs pin their activity plan on the wall (or post to a shared Padlet). Everyone walks around, reads them, and leaves one sticky note of feedback on each: 'Have you thought about...'</w:t>
+        <w:t>Facilitator projects a screenshot of a Kahoot setup screen. Each pair writes one question they'd ask the person who set it up about why they made each choice. Read a few aloud — you've just written your own facilitator audit.</w:t>
       </w:r>
     </w:p>
     <w:p/>
@@ -922,7 +1001,126 @@
       </w:pPr>
       <w:r>
         <w:rPr>
-          <w:color w:val="1A1A1A"/>
+          <w:color w:val="D19700"/>
+        </w:rPr>
+        <w:t>4. DISCUSSION (95 – 150 min)</w:t>
+      </w:r>
+    </w:p>
+    <w:p>
+      <w:r>
+        <w:rPr>
+          <w:b/>
+          <w:sz w:val="24"/>
+        </w:rPr>
+        <w:t>▶  Tool Speed-Date</w:t>
+      </w:r>
+    </w:p>
+    <w:p>
+      <w:r>
+        <w:rPr>
+          <w:color w:val="E91E8C"/>
+          <w:sz w:val="20"/>
+        </w:rPr>
+        <w:t>Tool: Mentimeter + Padlet + Kahoot</w:t>
+      </w:r>
+    </w:p>
+    <w:p>
+      <w:r>
+        <w:t>3-minute rotations. Each table has a different tool open. Try it for 3 minutes, then rotate. At the end, vote: which felt most useful for YOUR group?</w:t>
+      </w:r>
+    </w:p>
+    <w:p/>
+    <w:p>
+      <w:r>
+        <w:rPr>
+          <w:b/>
+          <w:sz w:val="24"/>
+        </w:rPr>
+        <w:t>▶  Design Your Own</w:t>
+      </w:r>
+    </w:p>
+    <w:p>
+      <w:r>
+        <w:rPr>
+          <w:color w:val="E91E8C"/>
+          <w:sz w:val="20"/>
+        </w:rPr>
+        <w:t>Tool: Paper or Padlet</w:t>
+      </w:r>
+    </w:p>
+    <w:p>
+      <w:r>
+        <w:t>In pairs, sketch a 10-minute digital activity you could run with your group next week. Use any tool. Keep it simple. Write: What tool? What do participants do? What's the one setting you'd change to make it work for YOUR group?</w:t>
+      </w:r>
+    </w:p>
+    <w:p/>
+    <w:p>
+      <w:r>
+        <w:rPr>
+          <w:b/>
+          <w:sz w:val="24"/>
+        </w:rPr>
+        <w:t>▶  Pitch Your Activity</w:t>
+      </w:r>
+    </w:p>
+    <w:p>
+      <w:r>
+        <w:t>Each pair gets 90 seconds to pitch their activity to another pair. No slides, no notes — just speak. The listening pair asks ONE question. Swap.</w:t>
+      </w:r>
+    </w:p>
+    <w:p/>
+    <w:p>
+      <w:r>
+        <w:rPr>
+          <w:b/>
+          <w:sz w:val="24"/>
+        </w:rPr>
+        <w:t>▶  Objection Panel</w:t>
+      </w:r>
+    </w:p>
+    <w:p>
+      <w:r>
+        <w:t>One pair presents their design to the room. Others play devil's advocate: 'What if the Wi-Fi dies?' 'What about the quietest young person?' 'What if someone doesn't have a phone?' The presenting pair doesn't need to solve every problem — just acknowledge it.</w:t>
+      </w:r>
+    </w:p>
+    <w:p/>
+    <w:p>
+      <w:r>
+        <w:rPr>
+          <w:b/>
+          <w:sz w:val="24"/>
+        </w:rPr>
+        <w:t>▶  Mix and Match</w:t>
+      </w:r>
+    </w:p>
+    <w:p>
+      <w:r>
+        <w:t>Pairs swap their design with another pair. Add one constraint: no Wi-Fi / one participant is non-verbal / half the group have no phone / there are 25 people not 10. Redesign in 10 minutes.</w:t>
+      </w:r>
+    </w:p>
+    <w:p/>
+    <w:p>
+      <w:r>
+        <w:rPr>
+          <w:b/>
+          <w:sz w:val="24"/>
+        </w:rPr>
+        <w:t>▶  Gallery Walk</w:t>
+      </w:r>
+    </w:p>
+    <w:p>
+      <w:r>
+        <w:t>Pairs pin their (now-redesigned) activity on the wall or post to a shared Padlet. Everyone walks around, reads them, and leaves one sticky note of feedback on each: 'Have you thought about…'</w:t>
+      </w:r>
+    </w:p>
+    <w:p/>
+    <w:p>
+      <w:pPr>
+        <w:pStyle w:val="Heading2"/>
+      </w:pPr>
+      <w:r>
+        <w:rPr>
+          <w:color w:val="00AA55"/>
         </w:rPr>
         <w:t>5. CLOSING (150 – 180 min)</w:t>
       </w:r>
@@ -930,9 +1128,7 @@
     <w:p>
       <w:r>
         <w:rPr>
-          <w:rFonts w:ascii="Calibri" w:hAnsi="Calibri"/>
           <w:b/>
-          <w:sz w:val="22"/>
         </w:rPr>
         <w:t>Closing Question:</w:t>
       </w:r>
@@ -940,9 +1136,8 @@
     <w:p>
       <w:r>
         <w:rPr>
-          <w:rFonts w:ascii="Calibri" w:hAnsi="Calibri"/>
-          <w:b/>
-          <w:color w:val="4EA8E6"/>
+          <w:i/>
+          <w:color w:val="00A6AD"/>
           <w:sz w:val="26"/>
         </w:rPr>
         <w:t>"What practice decision did you just make — without saying a word?"</w:t>
@@ -951,20 +1146,11 @@
     <w:p>
       <w:r>
         <w:rPr>
-          <w:rFonts w:ascii="Calibri" w:hAnsi="Calibri"/>
           <w:b/>
-          <w:sz w:val="22"/>
         </w:rPr>
-        <w:t>What this means:</w:t>
+        <w:t xml:space="preserve">What this means: </w:t>
       </w:r>
-    </w:p>
-    <w:p>
       <w:r>
-        <w:rPr>
-          <w:rFonts w:ascii="Calibri" w:hAnsi="Calibri"/>
-          <w:b w:val="0"/>
-          <w:sz w:val="22"/>
-        </w:rPr>
         <w:t>Every time you set up a digital space, you're making decisions about who can speak, who can see what, and who has control. Those are youth work decisions, not tech decisions.</w:t>
       </w:r>
     </w:p>
@@ -972,19 +1158,16 @@
     <w:p>
       <w:r>
         <w:rPr>
-          <w:rFonts w:ascii="Calibri" w:hAnsi="Calibri"/>
           <w:b/>
           <w:sz w:val="24"/>
         </w:rPr>
-        <w:t>▶  One Thing I'll Try  (10 min)</w:t>
+        <w:t>▶  One Thing I'll Try</w:t>
       </w:r>
     </w:p>
     <w:p>
       <w:r>
         <w:rPr>
-          <w:rFonts w:ascii="Calibri" w:hAnsi="Calibri"/>
-          <w:b w:val="0"/>
-          <w:color w:val="4EA8E6"/>
+          <w:color w:val="E91E8C"/>
           <w:sz w:val="20"/>
         </w:rPr>
         <w:t>Tool: Mentimeter or sticky notes</w:t>
@@ -992,11 +1175,6 @@
     </w:p>
     <w:p>
       <w:r>
-        <w:rPr>
-          <w:rFonts w:ascii="Calibri" w:hAnsi="Calibri"/>
-          <w:b w:val="0"/>
-          <w:sz w:val="22"/>
-        </w:rPr>
         <w:t>Everyone submits one thing they'll try with their group before the next session. Show results on screen. Photograph the wall.</w:t>
       </w:r>
     </w:p>
@@ -1004,41 +1182,56 @@
     <w:p>
       <w:r>
         <w:rPr>
-          <w:rFonts w:ascii="Calibri" w:hAnsi="Calibri"/>
           <w:b/>
           <w:sz w:val="24"/>
         </w:rPr>
-        <w:t>▶  Exit Ticket  (5 min)</w:t>
+        <w:t>▶  Commitment Partner</w:t>
       </w:r>
     </w:p>
     <w:p>
       <w:r>
-        <w:rPr>
-          <w:rFonts w:ascii="Calibri" w:hAnsi="Calibri"/>
-          <w:b w:val="0"/>
-          <w:sz w:val="22"/>
-        </w:rPr>
-        <w:t>On a sticky note: One thing you learnt. One thing you'll use. One question you still have. Hand them in on the way out.</w:t>
+        <w:t>Partner with someone NOT from your organisation. Swap contact details. Agree one thing you'll each try and check in in 2 weeks. Write it on a card and keep it.</w:t>
       </w:r>
     </w:p>
     <w:p/>
     <w:p>
       <w:r>
         <w:rPr>
-          <w:rFonts w:ascii="Calibri" w:hAnsi="Calibri"/>
           <w:b/>
-          <w:sz w:val="22"/>
+          <w:sz w:val="24"/>
         </w:rPr>
-        <w:t>Takeaway action:</w:t>
+        <w:t>▶  The Gap</w:t>
       </w:r>
     </w:p>
     <w:p>
       <w:r>
+        <w:t>On a paper: 'One thing I knew before this session. One thing I know now. One thing I still don't know.' Fold it. Hand it to the facilitator on the way out.</w:t>
+      </w:r>
+    </w:p>
+    <w:p/>
+    <w:p>
+      <w:r>
         <w:rPr>
-          <w:rFonts w:ascii="Calibri" w:hAnsi="Calibri"/>
-          <w:b w:val="0"/>
-          <w:sz w:val="22"/>
+          <w:b/>
+          <w:sz w:val="24"/>
         </w:rPr>
+        <w:t>▶  Exit Ticket</w:t>
+      </w:r>
+    </w:p>
+    <w:p>
+      <w:r>
+        <w:t>Sticky note on the door frame as you leave: one word that captures how you feel about running a digital activity this week. Read them back at the start of Session 2.</w:t>
+      </w:r>
+    </w:p>
+    <w:p/>
+    <w:p>
+      <w:r>
+        <w:rPr>
+          <w:b/>
+        </w:rPr>
+        <w:t xml:space="preserve">Takeaway action: </w:t>
+      </w:r>
+      <w:r>
         <w:t>Run one digital activity with your group this week. It doesn't have to be perfect.</w:t>
       </w:r>
     </w:p>
@@ -1054,19 +1247,9 @@
       </w:pPr>
       <w:r>
         <w:rPr>
-          <w:color w:val="1A1A1A"/>
+          <w:color w:val="E91E8C"/>
         </w:rPr>
         <w:t>Setup Checklist</w:t>
-      </w:r>
-    </w:p>
-    <w:p>
-      <w:r>
-        <w:rPr>
-          <w:rFonts w:ascii="Calibri" w:hAnsi="Calibri"/>
-          <w:b/>
-          <w:sz w:val="22"/>
-        </w:rPr>
-        <w:t>Complete before the session:</w:t>
       </w:r>
     </w:p>
     <w:p>
@@ -1098,7 +1281,7 @@
         <w:pStyle w:val="ListBullet"/>
       </w:pPr>
       <w:r>
-        <w:t>Set up Mentimeter + Padlet — test all links and logins</w:t>
+        <w:t>Set up Mentimeter or sticky notes — test all links and logins</w:t>
       </w:r>
     </w:p>
     <w:p>
@@ -1106,7 +1289,7 @@
         <w:pStyle w:val="ListBullet"/>
       </w:pPr>
       <w:r>
-        <w:t>Set up Mentimeter or sticky notes — test all links and logins</w:t>
+        <w:t>Set up Padlet — test all links and logins</w:t>
       </w:r>
     </w:p>
     <w:p>
@@ -1122,7 +1305,7 @@
         <w:pStyle w:val="ListBullet"/>
       </w:pPr>
       <w:r>
-        <w:t>Print any templates, cards, or handouts needed</w:t>
+        <w:t>Print templates, cards, or handouts</w:t>
       </w:r>
     </w:p>
     <w:p>
@@ -1130,7 +1313,7 @@
         <w:pStyle w:val="ListBullet"/>
       </w:pPr>
       <w:r>
-        <w:t>Have sticky notes and pens on every table</w:t>
+        <w:t>Sticky notes and pens on every table</w:t>
       </w:r>
     </w:p>
     <w:p>

</xml_diff>